<commit_message>
Emílio Santiago: revisão parte 2
Co-Authored-By: Claude Opus 5.5 <noreply@anthropic.com>
Claude-Session: https://claude.ai/code/session_01MJjUEEZrxQDEUifKK2vj9g
</commit_message>
<xml_diff>
--- a/roteiros/emilio-santiago/EmilioSantiago_Parte2.docx
+++ b/roteiros/emilio-santiago/EmilioSantiago_Parte2.docx
@@ -47,7 +47,7 @@
         <w:rPr>
           <w:color w:val="000000"/>
         </w:rPr>
-        <w:t>Durou pouco. Logo o nome Emílio Santiago voltou para a capa dos discos e nunca mais saiu.</w:t>
+        <w:t>O Teddy não ficou. Foi com o próprio nome que Emílio construiu a carreira.</w:t>
       </w:r>
     </w:p>
     <w:p>
@@ -55,7 +55,7 @@
         <w:rPr>
           <w:color w:val="000000"/>
         </w:rPr>
-        <w:t>Em mil novecentos e setenta e seis, assinou com a PolyGram e lançou "Brasileiríssimas". Foi o começo de uma longa fase na gravadora, com onze discos em que ele passeava pelo samba, pela música romântica e pelo jazz.</w:t>
+        <w:t>Em mil novecentos e setenta e seis, assinou com a PolyGram e lançou "Brasileiríssimas". Foi o começo de uma longa fase na gravadora, com onze discos em que ele passeava do samba ao jazz.</w:t>
       </w:r>
     </w:p>
     <w:p>
@@ -79,7 +79,7 @@
         <w:rPr>
           <w:color w:val="000000"/>
         </w:rPr>
-        <w:t>No meio disso, fez uma turnê pela Europa.</w:t>
+        <w:t>Em mil novecentos e oitenta e quatro, fez uma turnê pela Europa.</w:t>
       </w:r>
     </w:p>
     <w:p>
@@ -87,7 +87,7 @@
         <w:rPr>
           <w:color w:val="000000"/>
         </w:rPr>
-        <w:t>Canções como "Lembra de Mim" e "Verdade Chinesa" tocavam nas rádios. Emílio já era respeitado pelos músicos e conhecido pelo público.</w:t>
+        <w:t>Emílio já era respeitado pelos músicos e conhecido pelo público.</w:t>
       </w:r>
     </w:p>
     <w:p>
@@ -103,7 +103,7 @@
         <w:rPr>
           <w:color w:val="C00000"/>
         </w:rPr>
-        <w:t>O que transformou Emílio Santiago num dos cantores mais vendidos do país foi um convite que quase ninguém esperava que desse certo. Um único disco, pensado para ser só um, que acabou virando sete e mudou a vida dele para sempre. Inclusive a parte da vida dele que ninguém via.</w:t>
+        <w:t>O que transformou Emílio Santiago num dos cantores mais vendidos do país foi um convite. Um único disco, pensado para ser só um, que acabou virando sete e mudou a vida dele para sempre. Inclusive a parte da vida dele que ninguém via.</w:t>
       </w:r>
     </w:p>
     <w:p>
@@ -183,14 +183,6 @@
         <w:rPr>
           <w:color w:val="000000"/>
         </w:rPr>
-        <w:t>Até hoje, é difícil ouvir aquela voz sem lembrar do refrão.</w:t>
-      </w:r>
-    </w:p>
-    <w:p>
-      <w:r>
-        <w:rPr>
-          <w:color w:val="000000"/>
-        </w:rPr>
         <w:t>Os discos continuaram saindo, um atrás do outro, até mil novecentos e noventa e quatro. Foram sete volumes. Juntos, venderam mais de três milhões de cópias.</w:t>
       </w:r>
     </w:p>
@@ -215,7 +207,7 @@
         <w:rPr>
           <w:color w:val="000000"/>
         </w:rPr>
-        <w:t>Na entrevista ao Canal Brasil, lembrou um detalhe que o emocionava. Turistas estrangeiros levavam as "Aquarelas" para casa como lembrança musical do Brasil.</w:t>
+        <w:t>Na entrevista ao Canal Brasil, lembrou uma cena daqueles anos. Turistas estrangeiros levavam as "Aquarelas" para casa como lembrança musical do Brasil.</w:t>
       </w:r>
     </w:p>
     <w:p>
@@ -224,22 +216,6 @@
           <w:color w:val="000000"/>
         </w:rPr>
         <w:t>A voz de Emílio Santiago virou um souvenir do país.</w:t>
-      </w:r>
-    </w:p>
-    <w:p>
-      <w:r>
-        <w:rPr>
-          <w:color w:val="000000"/>
-        </w:rPr>
-        <w:t>Ele nunca parou de gravar. Em dois mil e dez, criou o próprio selo, a Santiago Music. Em dois mil e doze, aos sessenta e cinco anos, ganhou o Grammy Latino de melhor álbum de samba com o disco "Só Danço Samba, Ao Vivo".</w:t>
-      </w:r>
-    </w:p>
-    <w:p>
-      <w:r>
-        <w:rPr>
-          <w:color w:val="000000"/>
-        </w:rPr>
-        <w:t>Foi o último disco da vida dele. Poucos meses depois do prêmio, ele estaria morto.</w:t>
       </w:r>
     </w:p>
     <w:p>
@@ -263,7 +239,7 @@
         <w:rPr>
           <w:color w:val="000000"/>
         </w:rPr>
-        <w:t>Segundo o jornal O Dia, ao longo da vida ele acumulou imóveis em vários estados do Brasil. Um apartamento no Flamengo, outro em São Paulo, uma sala comercial em Copacabana, uma chácara em Petrópolis e uma casa de veraneio. Teve também um apartamento em Nova York, carros e joias.</w:t>
+        <w:t>Segundo o jornal O Dia, ao longo da vida ele acumulou imóveis em vários estados do Brasil, um apartamento em Nova York, carros e joias. Na lista da herança aparecem um apartamento no Flamengo, outro em São Paulo, uma sala comercial em Copacabana, uma chácara em Petrópolis e uma casa de veraneio.</w:t>
       </w:r>
     </w:p>
     <w:p>
@@ -287,7 +263,7 @@
         <w:rPr>
           <w:color w:val="000000"/>
         </w:rPr>
-        <w:t>Numa das últimas entrevistas, Emílio revelou um detalhe da própria origem. Os pais dele se separaram quando ele tinha seis dias de vida.</w:t>
+        <w:t>Uma reportagem publicada na semana do AVC contou um detalhe da origem dele. Os pais de Emílio se separaram quando ele tinha seis dias de vida.</w:t>
       </w:r>
     </w:p>
     <w:p>
@@ -327,7 +303,7 @@
         <w:rPr>
           <w:color w:val="000000"/>
         </w:rPr>
-        <w:t>Enquanto Emílio lotava teatros e acumulava discos de platina, Hercília trabalhava como copeira.</w:t>
+        <w:t>Quando Emílio morreu milionário, Hercília trabalhava como copeira.</w:t>
       </w:r>
     </w:p>
     <w:p>
@@ -383,7 +359,7 @@
         <w:rPr>
           <w:color w:val="000000"/>
         </w:rPr>
-        <w:t>Quem foi separado dos pais aos seis dias de vida cresce com outra ideia do que é família. Para Emílio, família parecia ser só quem estava perto dele.</w:t>
+        <w:t>Quem foi separado dos pais aos seis dias de vida aprende cedo que família nem sempre é a do sangue.</w:t>
       </w:r>
     </w:p>
     <w:p>
@@ -399,7 +375,7 @@
         <w:rPr>
           <w:color w:val="C00000"/>
         </w:rPr>
-        <w:t>Imagine por um momento ser essa irmã. Ver o próprio irmão cantar "Saigon" para milhares de pessoas e saber que, se alguém perguntasse, ele diria que você não existe. Só que Hercília não era a única pessoa que ficava fora da vida pública de Emílio Santiago. Havia alguém muito mais perto dele. Alguém que dormia na mesma casa.</w:t>
+        <w:t>Imagine por um momento ser essa irmã. Ver o próprio irmão cantar "Saigon" para milhares de pessoas e saber que, se alguém perguntasse, ele diria que você não existe. Só que Hercília não era a única pessoa que ficava fora da vida pública de Emílio Santiago. Havia alguém muito mais perto dele. Alguém que dividia a casa com ele.</w:t>
       </w:r>
     </w:p>
     <w:p>
@@ -471,14 +447,6 @@
         <w:rPr>
           <w:color w:val="000000"/>
         </w:rPr>
-        <w:t>Em outra entrevista, ele foi na mesma linha. Disse que vivia com naturalidade. E que ninguém nunca tinha escrito aquilo sobre ele.</w:t>
-      </w:r>
-    </w:p>
-    <w:p>
-      <w:r>
-        <w:rPr>
-          <w:color w:val="000000"/>
-        </w:rPr>
         <w:t>Entre os anos setenta e noventa, num país onde um cantor negro e gay enfrentava dois preconceitos ao mesmo tempo, o silêncio virou uma armadura.</w:t>
       </w:r>
     </w:p>
@@ -488,6 +456,22 @@
           <w:color w:val="000000"/>
         </w:rPr>
         <w:t>A armadura funcionou enquanto ele estava vivo.</w:t>
+      </w:r>
+    </w:p>
+    <w:p>
+      <w:r>
+        <w:rPr>
+          <w:color w:val="000000"/>
+        </w:rPr>
+        <w:t>Ele nunca parou de gravar. Em dois mil e dez, criou o próprio selo, a Santiago Music. Em dois mil e doze, aos sessenta e cinco anos, ganhou o Grammy Latino de melhor álbum de samba com o disco "Só Danço Samba, Ao Vivo".</w:t>
+      </w:r>
+    </w:p>
+    <w:p>
+      <w:r>
+        <w:rPr>
+          <w:color w:val="000000"/>
+        </w:rPr>
+        <w:t>Foi o último disco da vida dele. Poucos meses depois do prêmio, ele estaria morto.</w:t>
       </w:r>
     </w:p>
     <w:p>
@@ -511,7 +495,7 @@
         <w:rPr>
           <w:color w:val="000000"/>
         </w:rPr>
-        <w:t>No dia do enterro, Agnaldo definiu o amigo com uma expressão que ficou. Disse que Emílio era "elegante com a vida".</w:t>
+        <w:t>Na despedida, Agnaldo definiu o amigo com uma expressão que ficou. Disse que Emílio era "elegante com a vida".</w:t>
       </w:r>
     </w:p>
     <w:p>

</xml_diff>